<commit_message>
release: 0.27.0 — Forge-Erkennung im Vorflug
Root Cause: detect_forge lief erst in Phase 7 — ein unerkennbarer Host
(self-hosted ohne ci.provider) eskalierte einen echten Lauf erst nach
dem kompletten Build.

Fix: cli._preflight_forge prüft für echte run/resume/approve direkt nach
dem Config-Load und verweigert (Exit 1, kein Run, keine State-Änderung,
keine Eskalation). Dry-Run behält den GitLab-Rückfall; Phase 7 prüft
weiter als Sicherheitsnetz für Origin-/Config-Änderungen im Lauf.

Tests: vier CLI-Tests (run/resume/approve verweigern, Dry-Run-Rückfall).
Doku EN+DE, zwei Diagramme und Exporte nachgezogen.
Codex-Review: Runde 1 ohne Befund.

Co-Authored-By: Claude Opus 5.5 <noreply@anthropic.com>
Claude-Session: https://claude.ai/code/session_01E5wx4JMFc4yN9snrUcziA6
</commit_message>
<xml_diff>
--- a/docs/export/ADW-HANDBOOK.de.docx
+++ b/docs/export/ADW-HANDBOOK.de.docx
@@ -418,7 +418,7 @@
               <a:graphicData uri="http://schemas.openxmlformats.org/drawingml/2006/picture">
                 <pic:pic>
                   <pic:nvPicPr>
-                    <pic:cNvPr descr="/tmp/tmpi1srrkay/emf/diagrams/handbook/run-lifecycle.de.emf" id="25" name="Picture"/>
+                    <pic:cNvPr descr="/tmp/tmpd3afpfva/emf/diagrams/handbook/run-lifecycle.de.emf" id="25" name="Picture"/>
                     <pic:cNvPicPr>
                       <a:picLocks noChangeArrowheads="1" noChangeAspect="1"/>
                     </pic:cNvPicPr>
@@ -1348,7 +1348,7 @@
               <a:graphicData uri="http://schemas.openxmlformats.org/drawingml/2006/picture">
                 <pic:pic>
                   <pic:nvPicPr>
-                    <pic:cNvPr descr="/tmp/tmpi1srrkay/emf/diagrams/handbook/setup-path.de.emf" id="31" name="Picture"/>
+                    <pic:cNvPr descr="/tmp/tmpd3afpfva/emf/diagrams/handbook/setup-path.de.emf" id="31" name="Picture"/>
                     <pic:cNvPicPr>
                       <a:picLocks noChangeArrowheads="1" noChangeAspect="1"/>
                     </pic:cNvPicPr>
@@ -2764,7 +2764,7 @@
               <a:graphicData uri="http://schemas.openxmlformats.org/drawingml/2006/picture">
                 <pic:pic>
                   <pic:nvPicPr>
-                    <pic:cNvPr descr="/tmp/tmpi1srrkay/emf/diagrams/handbook/config-anatomy.de.emf" id="36" name="Picture"/>
+                    <pic:cNvPr descr="/tmp/tmpd3afpfva/emf/diagrams/handbook/config-anatomy.de.emf" id="36" name="Picture"/>
                     <pic:cNvPicPr>
                       <a:picLocks noChangeArrowheads="1" noChangeAspect="1"/>
                     </pic:cNvPicPr>
@@ -3467,23 +3467,40 @@
               <w:t xml:space="preserve">origin</w:t>
             </w:r>
             <w:r>
-              <w:t xml:space="preserve">-URL; ein unbekannter Host (z. B. self-hosted mit eigener Domain) fällt erst in Phase 7 auf — ein echter Lauf eskaliert dann</w:t>
+              <w:t xml:space="preserve">-URL; ein unbekannter Host (z. B. self-hosted mit eigener Domain) lässt ein echtes</w:t>
             </w:r>
             <w:r>
               <w:t xml:space="preserve"> </w:t>
             </w:r>
             <w:r>
               <w:rPr>
-                <w:b/>
-                <w:bCs/>
-              </w:rPr>
-              <w:t xml:space="preserve">nach</w:t>
+                <w:rStyle w:val="VerbatimChar"/>
+              </w:rPr>
+              <w:t xml:space="preserve">run</w:t>
+            </w:r>
+            <w:r>
+              <w:t xml:space="preserve">/</w:t>
+            </w:r>
+            <w:r>
+              <w:rPr>
+                <w:rStyle w:val="VerbatimChar"/>
+              </w:rPr>
+              <w:t xml:space="preserve">resume</w:t>
+            </w:r>
+            <w:r>
+              <w:t xml:space="preserve">/</w:t>
+            </w:r>
+            <w:r>
+              <w:rPr>
+                <w:rStyle w:val="VerbatimChar"/>
+              </w:rPr>
+              <w:t xml:space="preserve">approve</w:t>
             </w:r>
             <w:r>
               <w:t xml:space="preserve"> </w:t>
             </w:r>
             <w:r>
-              <w:t xml:space="preserve">dem kompletten Build (ein Dry-Run fällt still auf GitLab zurück). Bei self-hosted Forges den Key daher immer setzen.</w:t>
+              <w:t xml:space="preserve">schon im Vorflug scheitern, bevor ein Agent läuft (ein Dry-Run fällt auf GitLab zurück). Bei self-hosted Forges den Key daher immer setzen.</w:t>
             </w:r>
           </w:p>
         </w:tc>
@@ -6373,7 +6390,7 @@
               <a:graphicData uri="http://schemas.openxmlformats.org/drawingml/2006/picture">
                 <pic:pic>
                   <pic:nvPicPr>
-                    <pic:cNvPr descr="/tmp/tmpi1srrkay/emf/diagrams/handbook/gates-modes.de.emf" id="49" name="Picture"/>
+                    <pic:cNvPr descr="/tmp/tmpd3afpfva/emf/diagrams/handbook/gates-modes.de.emf" id="49" name="Picture"/>
                     <pic:cNvPicPr>
                       <a:picLocks noChangeArrowheads="1" noChangeAspect="1"/>
                     </pic:cNvPicPr>
@@ -7380,7 +7397,7 @@
         <w:t xml:space="preserve"> </w:t>
       </w:r>
       <w:r>
-        <w:t xml:space="preserve">Arbeitsbaum-Vorflug → Issue holen → Lauf anlegen. Ein Fehler in einem dieser</w:t>
+        <w:t xml:space="preserve">Forge-Vorflug (nur echte Läufe) → Arbeitsbaum-Vorflug → Issue holen → Lauf anlegen. Ein Fehler in einem dieser</w:t>
       </w:r>
       <w:r>
         <w:t xml:space="preserve"> </w:t>
@@ -8490,7 +8507,7 @@
               <a:graphicData uri="http://schemas.openxmlformats.org/drawingml/2006/picture">
                 <pic:pic>
                   <pic:nvPicPr>
-                    <pic:cNvPr descr="/tmp/tmpi1srrkay/emf/diagrams/handbook/gui-layout.de.emf" id="66" name="Picture"/>
+                    <pic:cNvPr descr="/tmp/tmpd3afpfva/emf/diagrams/handbook/gui-layout.de.emf" id="66" name="Picture"/>
                     <pic:cNvPicPr>
                       <a:picLocks noChangeArrowheads="1" noChangeAspect="1"/>
                     </pic:cNvPicPr>
@@ -9280,7 +9297,7 @@
               <a:graphicData uri="http://schemas.openxmlformats.org/drawingml/2006/picture">
                 <pic:pic>
                   <pic:nvPicPr>
-                    <pic:cNvPr descr="/tmp/tmpi1srrkay/emf/diagrams/handbook/run-artifacts.de.emf" id="72" name="Picture"/>
+                    <pic:cNvPr descr="/tmp/tmpd3afpfva/emf/diagrams/handbook/run-artifacts.de.emf" id="72" name="Picture"/>
                     <pic:cNvPicPr>
                       <a:picLocks noChangeArrowheads="1" noChangeAspect="1"/>
                     </pic:cNvPicPr>
@@ -12394,7 +12411,7 @@
               <a:graphicData uri="http://schemas.openxmlformats.org/drawingml/2006/picture">
                 <pic:pic>
                   <pic:nvPicPr>
-                    <pic:cNvPr descr="/tmp/tmpi1srrkay/emf/diagrams/handbook/troubleshooting.de.emf" id="85" name="Picture"/>
+                    <pic:cNvPr descr="/tmp/tmpd3afpfva/emf/diagrams/handbook/troubleshooting.de.emf" id="85" name="Picture"/>
                     <pic:cNvPicPr>
                       <a:picLocks noChangeArrowheads="1" noChangeAspect="1"/>
                     </pic:cNvPicPr>

</xml_diff>

<commit_message>
release: 0.28.0 — Agents und Codex auf den neuesten Modellen
Opus 4.8 -> Opus 5.5 (claude-opus-5-5), Fable 5 -> Fable 5.1
(claude-fable-5-1), Sonnet 5 -> Sonnet 5.5 (claude-sonnet-5-5); alle drei
per echtem Claude-Code-CLI-Aufruf geprüft.

Codex wird jetzt explizit auf gpt-6-astra gepinnt (-m). Root Cause des
bisherigen Verhaltens: das isolierte CODEX_HOME hat keine config.toml,
ohne -m lief codex unbemerkt auf seinem eingebauten Default.

Tests: Registry-Modelle angepasst (RED -> GREEN), neuer Test für -m im
codex-argv. Doku, Diagramme und Exporte EN+DE nachgezogen; Spec-Aussage
"Fable ist günstiger" korrigiert.
Codex-Review: ohne Befund.

Co-Authored-By: Claude Opus 5.5 <noreply@anthropic.com>
Claude-Session: https://claude.ai/code/session_01E5wx4JMFc4yN9snrUcziA6
</commit_message>
<xml_diff>
--- a/docs/export/ADW-HANDBOOK.de.docx
+++ b/docs/export/ADW-HANDBOOK.de.docx
@@ -418,7 +418,7 @@
               <a:graphicData uri="http://schemas.openxmlformats.org/drawingml/2006/picture">
                 <pic:pic>
                   <pic:nvPicPr>
-                    <pic:cNvPr descr="/tmp/tmpd3afpfva/emf/diagrams/handbook/run-lifecycle.de.emf" id="25" name="Picture"/>
+                    <pic:cNvPr descr="/tmp/tmprjwl9ly9/emf/diagrams/handbook/run-lifecycle.de.emf" id="25" name="Picture"/>
                     <pic:cNvPicPr>
                       <a:picLocks noChangeArrowheads="1" noChangeAspect="1"/>
                     </pic:cNvPicPr>
@@ -1007,13 +1007,13 @@
               <w:jc w:val="left"/>
             </w:pPr>
             <w:r>
-              <w:t xml:space="preserve">Opus 4.8 (</w:t>
+              <w:t xml:space="preserve">Opus 5.5 (</w:t>
             </w:r>
             <w:r>
               <w:rPr>
                 <w:rStyle w:val="VerbatimChar"/>
               </w:rPr>
-              <w:t xml:space="preserve">claude-opus-4-8</w:t>
+              <w:t xml:space="preserve">claude-opus-5-5</w:t>
             </w:r>
             <w:r>
               <w:t xml:space="preserve">)</w:t>
@@ -1060,7 +1060,7 @@
               <w:rPr>
                 <w:rStyle w:val="VerbatimChar"/>
               </w:rPr>
-              <w:t xml:space="preserve">codex exec --sandbox read-only</w:t>
+              <w:t xml:space="preserve">codex exec -m gpt-6-astra --sandbox read-only</w:t>
             </w:r>
             <w:r>
               <w:t xml:space="preserve">)</w:t>
@@ -1101,13 +1101,13 @@
               <w:jc w:val="left"/>
             </w:pPr>
             <w:r>
-              <w:t xml:space="preserve">Fable 5 (</w:t>
+              <w:t xml:space="preserve">Fable 5.1 (</w:t>
             </w:r>
             <w:r>
               <w:rPr>
                 <w:rStyle w:val="VerbatimChar"/>
               </w:rPr>
-              <w:t xml:space="preserve">claude-fable-5</w:t>
+              <w:t xml:space="preserve">claude-fable-5-1</w:t>
             </w:r>
             <w:r>
               <w:t xml:space="preserve">)</w:t>
@@ -1148,7 +1148,7 @@
               <w:jc w:val="left"/>
             </w:pPr>
             <w:r>
-              <w:t xml:space="preserve">Opus 4.8</w:t>
+              <w:t xml:space="preserve">Opus 5.5</w:t>
             </w:r>
           </w:p>
         </w:tc>
@@ -1186,13 +1186,13 @@
               <w:jc w:val="left"/>
             </w:pPr>
             <w:r>
-              <w:t xml:space="preserve">Sonnet 5 (</w:t>
+              <w:t xml:space="preserve">Sonnet 5.5 (</w:t>
             </w:r>
             <w:r>
               <w:rPr>
                 <w:rStyle w:val="VerbatimChar"/>
               </w:rPr>
-              <w:t xml:space="preserve">claude-sonnet-5</w:t>
+              <w:t xml:space="preserve">claude-sonnet-5-5</w:t>
             </w:r>
             <w:r>
               <w:t xml:space="preserve">)</w:t>
@@ -1233,7 +1233,7 @@
               <w:jc w:val="left"/>
             </w:pPr>
             <w:r>
-              <w:t xml:space="preserve">Fable 5</w:t>
+              <w:t xml:space="preserve">Fable 5.1</w:t>
             </w:r>
           </w:p>
         </w:tc>
@@ -1348,7 +1348,7 @@
               <a:graphicData uri="http://schemas.openxmlformats.org/drawingml/2006/picture">
                 <pic:pic>
                   <pic:nvPicPr>
-                    <pic:cNvPr descr="/tmp/tmpd3afpfva/emf/diagrams/handbook/setup-path.de.emf" id="31" name="Picture"/>
+                    <pic:cNvPr descr="/tmp/tmprjwl9ly9/emf/diagrams/handbook/setup-path.de.emf" id="31" name="Picture"/>
                     <pic:cNvPicPr>
                       <a:picLocks noChangeArrowheads="1" noChangeAspect="1"/>
                     </pic:cNvPicPr>
@@ -1801,7 +1801,7 @@
               <w:jc w:val="left"/>
             </w:pPr>
             <w:r>
-              <w:t xml:space="preserve">Ein Plan, der Fable 5, Opus 4.8 und Sonnet 5 enthält</w:t>
+              <w:t xml:space="preserve">Ein Plan, der Fable 5.1, Opus 5.5 und Sonnet 5.5 enthält</w:t>
             </w:r>
           </w:p>
         </w:tc>
@@ -2764,7 +2764,7 @@
               <a:graphicData uri="http://schemas.openxmlformats.org/drawingml/2006/picture">
                 <pic:pic>
                   <pic:nvPicPr>
-                    <pic:cNvPr descr="/tmp/tmpd3afpfva/emf/diagrams/handbook/config-anatomy.de.emf" id="36" name="Picture"/>
+                    <pic:cNvPr descr="/tmp/tmprjwl9ly9/emf/diagrams/handbook/config-anatomy.de.emf" id="36" name="Picture"/>
                     <pic:cNvPicPr>
                       <a:picLocks noChangeArrowheads="1" noChangeAspect="1"/>
                     </pic:cNvPicPr>
@@ -6390,7 +6390,7 @@
               <a:graphicData uri="http://schemas.openxmlformats.org/drawingml/2006/picture">
                 <pic:pic>
                   <pic:nvPicPr>
-                    <pic:cNvPr descr="/tmp/tmpd3afpfva/emf/diagrams/handbook/gates-modes.de.emf" id="49" name="Picture"/>
+                    <pic:cNvPr descr="/tmp/tmprjwl9ly9/emf/diagrams/handbook/gates-modes.de.emf" id="49" name="Picture"/>
                     <pic:cNvPicPr>
                       <a:picLocks noChangeArrowheads="1" noChangeAspect="1"/>
                     </pic:cNvPicPr>
@@ -8507,7 +8507,7 @@
               <a:graphicData uri="http://schemas.openxmlformats.org/drawingml/2006/picture">
                 <pic:pic>
                   <pic:nvPicPr>
-                    <pic:cNvPr descr="/tmp/tmpd3afpfva/emf/diagrams/handbook/gui-layout.de.emf" id="66" name="Picture"/>
+                    <pic:cNvPr descr="/tmp/tmprjwl9ly9/emf/diagrams/handbook/gui-layout.de.emf" id="66" name="Picture"/>
                     <pic:cNvPicPr>
                       <a:picLocks noChangeArrowheads="1" noChangeAspect="1"/>
                     </pic:cNvPicPr>
@@ -9297,7 +9297,7 @@
               <a:graphicData uri="http://schemas.openxmlformats.org/drawingml/2006/picture">
                 <pic:pic>
                   <pic:nvPicPr>
-                    <pic:cNvPr descr="/tmp/tmpd3afpfva/emf/diagrams/handbook/run-artifacts.de.emf" id="72" name="Picture"/>
+                    <pic:cNvPr descr="/tmp/tmprjwl9ly9/emf/diagrams/handbook/run-artifacts.de.emf" id="72" name="Picture"/>
                     <pic:cNvPicPr>
                       <a:picLocks noChangeArrowheads="1" noChangeAspect="1"/>
                     </pic:cNvPicPr>
@@ -12411,7 +12411,7 @@
               <a:graphicData uri="http://schemas.openxmlformats.org/drawingml/2006/picture">
                 <pic:pic>
                   <pic:nvPicPr>
-                    <pic:cNvPr descr="/tmp/tmpd3afpfva/emf/diagrams/handbook/troubleshooting.de.emf" id="85" name="Picture"/>
+                    <pic:cNvPr descr="/tmp/tmprjwl9ly9/emf/diagrams/handbook/troubleshooting.de.emf" id="85" name="Picture"/>
                     <pic:cNvPicPr>
                       <a:picLocks noChangeArrowheads="1" noChangeAspect="1"/>
                     </pic:cNvPicPr>
@@ -13098,13 +13098,13 @@
         <w:t xml:space="preserve"> </w:t>
       </w:r>
       <w:r>
-        <w:t xml:space="preserve">Dry Run: nichts. Echter Lauf: nur Plan-Kontingent — Fable 5 für Synthese und</w:t>
-      </w:r>
-      <w:r>
-        <w:t xml:space="preserve"> </w:t>
-      </w:r>
-      <w:r>
-        <w:t xml:space="preserve">finales Review, Opus 4.8 für Authoring-Entwürfe und Build, Sonnet 5 für</w:t>
+        <w:t xml:space="preserve">Dry Run: nichts. Echter Lauf: nur Plan-Kontingent — Fable 5.1 für Synthese und</w:t>
+      </w:r>
+      <w:r>
+        <w:t xml:space="preserve"> </w:t>
+      </w:r>
+      <w:r>
+        <w:t xml:space="preserve">finales Review, Opus 5.5 für Authoring-Entwürfe und Build, Sonnet 5.5 für</w:t>
       </w:r>
       <w:r>
         <w:t xml:space="preserve"> </w:t>
@@ -13408,7 +13408,7 @@
               <w:jc w:val="left"/>
             </w:pPr>
             <w:r>
-              <w:t xml:space="preserve">Zwei unabhängige Entwürfe (Claude + Codex), von Fable 5 zu einem Best-of-Artefakt plus Zusammenfassung zusammengeführt.</w:t>
+              <w:t xml:space="preserve">Zwei unabhängige Entwürfe (Claude + Codex), von Fable 5.1 zu einem Best-of-Artefakt plus Zusammenfassung zusammengeführt.</w:t>
             </w:r>
           </w:p>
         </w:tc>

</xml_diff>

<commit_message>
release: 0.29.1 — Known Limitations des Modell-Checks behoben
1. Reihenfolge: Der Modell-Check lief vor dem Arbeitsbaum-Vorflug — ein
   schmutziger Checkout mit kaltem Cache kostete drei Probe-Aufrufe,
   bevor er abgelehnt wurde. Jetzt prüfen run/resume/approve zuerst den
   Arbeitsbaum, dann die Modelle.
2. Ein Cache-Zeitstempel ohne Zeitzone (von Hand editiert) warf
   TypeError und brach jeden echten Start ab. Jetzt Cache-Miss.

Tests: drei Regressionstests in tests/test_models.py (Reihenfolge für
run sowie resume/approve über aufgezeichnete Probes, naiver Zeitstempel).
Doku EN+DE, Exporte nachgezogen.
Codex-Review: ohne Befund.

Co-Authored-By: Claude Opus 5.5 <noreply@anthropic.com>
Claude-Session: https://claude.ai/code/session_01E5wx4JMFc4yN9snrUcziA6
</commit_message>
<xml_diff>
--- a/docs/export/ADW-HANDBOOK.de.docx
+++ b/docs/export/ADW-HANDBOOK.de.docx
@@ -418,7 +418,7 @@
               <a:graphicData uri="http://schemas.openxmlformats.org/drawingml/2006/picture">
                 <pic:pic>
                   <pic:nvPicPr>
-                    <pic:cNvPr descr="/tmp/tmpl0mo_s_5/emf/diagrams/handbook/run-lifecycle.de.emf" id="25" name="Picture"/>
+                    <pic:cNvPr descr="/tmp/tmp0334j8nq/emf/diagrams/handbook/run-lifecycle.de.emf" id="25" name="Picture"/>
                     <pic:cNvPicPr>
                       <a:picLocks noChangeArrowheads="1" noChangeAspect="1"/>
                     </pic:cNvPicPr>
@@ -1348,7 +1348,7 @@
               <a:graphicData uri="http://schemas.openxmlformats.org/drawingml/2006/picture">
                 <pic:pic>
                   <pic:nvPicPr>
-                    <pic:cNvPr descr="/tmp/tmpl0mo_s_5/emf/diagrams/handbook/setup-path.de.emf" id="31" name="Picture"/>
+                    <pic:cNvPr descr="/tmp/tmp0334j8nq/emf/diagrams/handbook/setup-path.de.emf" id="31" name="Picture"/>
                     <pic:cNvPicPr>
                       <a:picLocks noChangeArrowheads="1" noChangeAspect="1"/>
                     </pic:cNvPicPr>
@@ -2764,7 +2764,7 @@
               <a:graphicData uri="http://schemas.openxmlformats.org/drawingml/2006/picture">
                 <pic:pic>
                   <pic:nvPicPr>
-                    <pic:cNvPr descr="/tmp/tmpl0mo_s_5/emf/diagrams/handbook/config-anatomy.de.emf" id="36" name="Picture"/>
+                    <pic:cNvPr descr="/tmp/tmp0334j8nq/emf/diagrams/handbook/config-anatomy.de.emf" id="36" name="Picture"/>
                     <pic:cNvPicPr>
                       <a:picLocks noChangeArrowheads="1" noChangeAspect="1"/>
                     </pic:cNvPicPr>
@@ -6390,7 +6390,7 @@
               <a:graphicData uri="http://schemas.openxmlformats.org/drawingml/2006/picture">
                 <pic:pic>
                   <pic:nvPicPr>
-                    <pic:cNvPr descr="/tmp/tmpl0mo_s_5/emf/diagrams/handbook/gates-modes.de.emf" id="49" name="Picture"/>
+                    <pic:cNvPr descr="/tmp/tmp0334j8nq/emf/diagrams/handbook/gates-modes.de.emf" id="49" name="Picture"/>
                     <pic:cNvPicPr>
                       <a:picLocks noChangeArrowheads="1" noChangeAspect="1"/>
                     </pic:cNvPicPr>
@@ -7397,7 +7397,7 @@
         <w:t xml:space="preserve"> </w:t>
       </w:r>
       <w:r>
-        <w:t xml:space="preserve">Forge-Vorflug → Modell-Check (beide nur echte Läufe) → Arbeitsbaum-Vorflug → Issue holen → Lauf anlegen. Ein Fehler in einem dieser</w:t>
+        <w:t xml:space="preserve">Forge-Vorflug → Arbeitsbaum-Vorflug → Modell-Check (Forge + Modelle: nur echte Läufe) → Issue holen → Lauf anlegen. Ein Fehler in einem dieser</w:t>
       </w:r>
       <w:r>
         <w:t xml:space="preserve"> </w:t>
@@ -8507,7 +8507,7 @@
               <a:graphicData uri="http://schemas.openxmlformats.org/drawingml/2006/picture">
                 <pic:pic>
                   <pic:nvPicPr>
-                    <pic:cNvPr descr="/tmp/tmpl0mo_s_5/emf/diagrams/handbook/gui-layout.de.emf" id="66" name="Picture"/>
+                    <pic:cNvPr descr="/tmp/tmp0334j8nq/emf/diagrams/handbook/gui-layout.de.emf" id="66" name="Picture"/>
                     <pic:cNvPicPr>
                       <a:picLocks noChangeArrowheads="1" noChangeAspect="1"/>
                     </pic:cNvPicPr>
@@ -9297,7 +9297,7 @@
               <a:graphicData uri="http://schemas.openxmlformats.org/drawingml/2006/picture">
                 <pic:pic>
                   <pic:nvPicPr>
-                    <pic:cNvPr descr="/tmp/tmpl0mo_s_5/emf/diagrams/handbook/run-artifacts.de.emf" id="72" name="Picture"/>
+                    <pic:cNvPr descr="/tmp/tmp0334j8nq/emf/diagrams/handbook/run-artifacts.de.emf" id="72" name="Picture"/>
                     <pic:cNvPicPr>
                       <a:picLocks noChangeArrowheads="1" noChangeAspect="1"/>
                     </pic:cNvPicPr>
@@ -12411,7 +12411,7 @@
               <a:graphicData uri="http://schemas.openxmlformats.org/drawingml/2006/picture">
                 <pic:pic>
                   <pic:nvPicPr>
-                    <pic:cNvPr descr="/tmp/tmpl0mo_s_5/emf/diagrams/handbook/troubleshooting.de.emf" id="85" name="Picture"/>
+                    <pic:cNvPr descr="/tmp/tmp0334j8nq/emf/diagrams/handbook/troubleshooting.de.emf" id="85" name="Picture"/>
                     <pic:cNvPicPr>
                       <a:picLocks noChangeArrowheads="1" noChangeAspect="1"/>
                     </pic:cNvPicPr>

</xml_diff>